<commit_message>
Read every default source from its producer; Open-Meteo only as backup
- Hourly wind defaults to NASA MERRA-2 from NASA POWER; ECMWF via Open-Meteo
  takes over after an error or 20 s without an answer, or when chosen
- Daily weather: gridMET, then NASA POWER daily with FAO-56 Penman-Monteith
  ET0 computed in the app (Hargreaves only on days missing an input), then
  Open-Meteo; at Lubbock POWER PM ET0 is 5% above gridMET
- fetchText gets the same first-response limit as fetchJSON
- Lubbock calibrated result unchanged in substance: 1,295 h/yr (ECMWF 1,291),
  Feb-Apr, WSW
- Methods sheet, README, METHODS.md and the data-flow document updated

Co-Authored-By: Claude Opus 5.5 <noreply@anthropic.com>
</commit_message>
<xml_diff>
--- a/docs/WindGuard_TX_Data_Flow.docx
+++ b/docs/WindGuard_TX_Data_Flow.docx
@@ -31,7 +31,7 @@
           <w:color w:val="616E7C"/>
           <w:sz w:val="18"/>
         </w:rPr>
-        <w:t>App: barsa1ly.github.io/windguard-tx   ·   Code: github.com/barsa1ly/windguard-tx (commit 784c039)   ·   October 28, 2026</w:t>
+        <w:t>App: barsa1ly.github.io/windguard-tx   ·   Code: github.com/barsa1ly/windguard-tx (commit 63ada32)   ·   October 28, 2026</w:t>
       </w:r>
     </w:p>
     <w:p>
@@ -180,7 +180,7 @@
         <w:t>Gridded wind and moisture, at the same time.</w:t>
       </w:r>
       <w:r>
-        <w:t xml:space="preserve"> Hourly wind for the chosen period comes from ECMWF through Open-Meteo (usually 1–3 s) or NASA MERRA-2. If Open-Meteo errors or has not answered within 20 s, the app switches to MERRA-2. Daily rain and ET₀ come from gridMET. The Wind tab first shows the model, uncalibrated.</w:t>
+        <w:t xml:space="preserve"> Hourly wind for the chosen period comes straight from NASA (MERRA-2 through NASA POWER, usually 1–3 s). If NASA errors or has not answered within 20 s, the app switches to ECMWF through Open-Meteo. Daily rain and ET₀ come from gridMET, else NASA POWER, else Open-Meteo. The Wind tab first shows the model, uncalibrated.</w:t>
       </w:r>
     </w:p>
     <w:p>
@@ -1499,7 +1499,7 @@
                 <w:b/>
                 <w:sz w:val="18"/>
               </w:rPr>
-              <w:t>Reference ET (last fallback)</w:t>
+              <w:t>Reference ET when gridMET fails</w:t>
             </w:r>
           </w:p>
         </w:tc>
@@ -1515,7 +1515,7 @@
               <w:rPr>
                 <w:sz w:val="18"/>
               </w:rPr>
-              <w:t>Hargreaves: ET₀ = 0.0023 Ra (Tmean + 17.8) √(Tmax − Tmin)</w:t>
+              <w:t>FAO-56 Penman–Monteith from NASA POWER Tmax, Tmin, dew point, 2 m wind and solar radiation (Rn = 0.77 Rs − Rnl, G = 0); Hargreaves 0.0023 Ra (T + 17.8) √(Tmax − Tmin) on days missing an input</w:t>
             </w:r>
           </w:p>
         </w:tc>
@@ -3159,7 +3159,7 @@
               <w:rPr>
                 <w:sz w:val="17"/>
               </w:rPr>
-              <w:t>Open-Meteo daily (ECMWF), then NASA POWER daily with Hargreaves ET₀</w:t>
+              <w:t>NASA POWER daily with Penman–Monteith ET₀ computed in the app, then Open-Meteo daily (ECMWF)</w:t>
             </w:r>
           </w:p>
         </w:tc>
@@ -3181,7 +3181,7 @@
                 <w:b/>
                 <w:sz w:val="17"/>
               </w:rPr>
-              <w:t>Hourly 10 m wind speed and direction, daily max gust (default)</w:t>
+              <w:t>Hourly 10 m wind speed and direction (default)</w:t>
             </w:r>
           </w:p>
         </w:tc>
@@ -3197,7 +3197,7 @@
               <w:rPr>
                 <w:sz w:val="17"/>
               </w:rPr>
-              <w:t>ECMWF: IFS analysis from 2017, ERA5 before</w:t>
+              <w:t>NASA GMAO MERRA-2</w:t>
             </w:r>
           </w:p>
         </w:tc>
@@ -3213,7 +3213,7 @@
               <w:rPr>
                 <w:sz w:val="17"/>
               </w:rPr>
-              <w:t>Open-Meteo archive (re-hosted copy); two requests in parallel</w:t>
+              <w:t>NASA POWER hourly API (direct)</w:t>
             </w:r>
           </w:p>
         </w:tc>
@@ -3229,7 +3229,7 @@
               <w:rPr>
                 <w:sz w:val="17"/>
               </w:rPr>
-              <w:t>9 km from 2017; 0.25° (~28 km) before</w:t>
+              <w:t>0.5° × 0.625° (~50 km), 2001 on; no gust variable</w:t>
             </w:r>
           </w:p>
         </w:tc>
@@ -3245,7 +3245,7 @@
               <w:rPr>
                 <w:sz w:val="17"/>
               </w:rPr>
-              <w:t>NASA MERRA-2 if Open-Meteo errors or has not answered within 20 s</w:t>
+              <w:t>ECMWF via Open-Meteo if NASA POWER errors or has not answered within 20 s</w:t>
             </w:r>
           </w:p>
         </w:tc>
@@ -3268,7 +3268,7 @@
                 <w:b/>
                 <w:sz w:val="17"/>
               </w:rPr>
-              <w:t>Hourly 10 m wind speed and direction (alternative)</w:t>
+              <w:t>Hourly 10 m wind, daily max gust (backup, or when chosen)</w:t>
             </w:r>
           </w:p>
         </w:tc>
@@ -3285,7 +3285,7 @@
               <w:rPr>
                 <w:sz w:val="17"/>
               </w:rPr>
-              <w:t>NASA GMAO MERRA-2</w:t>
+              <w:t>ECMWF: IFS analysis from 2017, ERA5 before</w:t>
             </w:r>
           </w:p>
         </w:tc>
@@ -3302,7 +3302,7 @@
               <w:rPr>
                 <w:sz w:val="17"/>
               </w:rPr>
-              <w:t>NASA POWER hourly API (direct)</w:t>
+              <w:t>Open-Meteo archive (re-hosted copy)</w:t>
             </w:r>
           </w:p>
         </w:tc>
@@ -3319,7 +3319,7 @@
               <w:rPr>
                 <w:sz w:val="17"/>
               </w:rPr>
-              <w:t>0.5° × 0.625° (~50 km), 2001 on; no gust variable</w:t>
+              <w:t>9 km from 2017; 0.25° (~28 km) before</w:t>
             </w:r>
           </w:p>
         </w:tc>
@@ -3336,7 +3336,7 @@
               <w:rPr>
                 <w:sz w:val="17"/>
               </w:rPr>
-              <w:t>ECMWF via Open-Meteo</w:t>
+              <w:t>NASA MERRA-2</w:t>
             </w:r>
           </w:p>
         </w:tc>
@@ -4028,7 +4028,7 @@
               <w:rPr>
                 <w:sz w:val="18"/>
               </w:rPr>
-              <w:t>ECMWF (Open-Meteo) or MERRA-2, calibrated to the NOAA airport</w:t>
+              <w:t>NASA MERRA-2 (ECMWF via Open-Meteo as backup), calibrated to the NOAA airport</w:t>
             </w:r>
           </w:p>
         </w:tc>
@@ -4572,10 +4572,10 @@
         <w:rPr>
           <w:b/>
         </w:rPr>
-        <w:t>ECMWF comes through a copy.</w:t>
+        <w:t>Open-Meteo is only a backup.</w:t>
       </w:r>
       <w:r>
-        <w:t xml:space="preserve"> Copernicus's own data store needs each user's personal key and a queued job that takes minutes, so the app reads Open-Meteo's copy, which arrives in seconds. NASA MERRA-2 is the direct alternative and the automatic fallback.</w:t>
+        <w:t xml:space="preserve"> Every default source is direct. Open-Meteo steps in for wind when NASA POWER errors or has not answered within 20 s, for daily weather when gridMET and NASA POWER both fail, for elevation when USGS fails, and when you choose ECMWF (Copernicus's own store needs each user's key and a queued job). After calibration both models give 1,291–1,295 erosive h/yr at Lubbock.</w:t>
       </w:r>
     </w:p>
     <w:p>
@@ -4605,7 +4605,7 @@
         <w:t>MERRA-2 has no gusts.</w:t>
       </w:r>
       <w:r>
-        <w:t xml:space="preserve"> Its daily maximum hourly wind stands in for gusts during calibration, and gust days show n/a.</w:t>
+        <w:t xml:space="preserve"> Its daily maximum hourly wind stands in for gusts during calibration; without an airport, gust days show n/a.</w:t>
       </w:r>
     </w:p>
     <w:p>
@@ -4620,7 +4620,7 @@
         <w:t>gridMET lags a few days.</w:t>
       </w:r>
       <w:r>
-        <w:t xml:space="preserve"> The newest ~4 days are not yet published; a point with less than 80 % of days falls back to Open-Meteo and then NASA POWER.</w:t>
+        <w:t xml:space="preserve"> The newest ~4 days are not yet published; a point with less than 80 % of days falls back to NASA POWER and then Open-Meteo.</w:t>
       </w:r>
     </w:p>
     <w:p>

</xml_diff>

<commit_message>
Area analysis tool; refuse map clicks on buildings, roads and water
- Polygon button: draw a field or upload a boundary (.zip shapefile,
  .shp/.dbf/.prj with reprojection, .kml, .kmz, .geojson; up to 500 km2)
- Soil Data Access clips SSURGO map units to the boundary; ~20,000 seeded
  stratified random points give the share and acres in each WEG and
  bare-soil risk class (components weighted by %), mean I and E, map units;
  soils coloured by WEG on the map; CSV export
- Left out: FEMA/ORNL USA Structures buildings, Census TIGER roads widened
  by road class, USGS NHD water bodies (Esri NHD copy if NHD is slow) and
  SSURGO Water map units
- Map clicks and pin drags on a building, road or water are refused with
  the reason (accepted if the services take over 3.5 s)
- Methods sheet, README, METHODS.md and the data-flow document (new
  Figure 4 and tables) updated

Co-Authored-By: Claude Opus 5.5 <noreply@anthropic.com>
</commit_message>
<xml_diff>
--- a/docs/WindGuard_TX_Data_Flow.docx
+++ b/docs/WindGuard_TX_Data_Flow.docx
@@ -31,7 +31,7 @@
           <w:color w:val="616E7C"/>
           <w:sz w:val="18"/>
         </w:rPr>
-        <w:t>App: barsa1ly.github.io/windguard-tx   ·   Code: github.com/barsa1ly/windguard-tx (commit 63ada32)   ·   October 28, 2026</w:t>
+        <w:t>App: barsa1ly.github.io/windguard-tx   ·   Code: github.com/barsa1ly/windguard-tx (commit cb3fec1)   ·   October 28, 2026</w:t>
       </w:r>
     </w:p>
     <w:p>
@@ -135,7 +135,7 @@
         <w:t>Location check.</w:t>
       </w:r>
       <w:r>
-        <w:t xml:space="preserve"> The point is tested against the Texas outline drawn on the map (U.S. Census 1:5,000,000 state boundary). Outside it, the app shows a message and downloads nothing. Place search lists only places inside Texas.</w:t>
+        <w:t xml:space="preserve"> The point is tested against the Texas outline drawn on the map (U.S. Census 1:5,000,000 state boundary). A map click or pin drag is also checked against building footprints (USA Structures), roads (Census TIGER) and water bodies (USGS NHD). If it fails, the app says why and downloads nothing. Place search lists only places inside Texas.</w:t>
       </w:r>
     </w:p>
     <w:p>
@@ -444,7 +444,72 @@
         <w:spacing w:before="0"/>
       </w:pPr>
       <w:r>
-        <w:t>7. Calculations, step by step</w:t>
+        <w:t>7. Field or area analysis</w:t>
+      </w:r>
+    </w:p>
+    <w:p>
+      <w:r>
+        <w:t>The area tool (polygon button on the map) works on a whole field or ranch instead of one point. Four sources are read at once for the boundary; sample points then give the share of the open land in each Wind Erodibility Group and risk class.</w:t>
+      </w:r>
+    </w:p>
+    <w:p>
+      <w:pPr>
+        <w:spacing w:after="40"/>
+        <w:jc w:val="center"/>
+      </w:pPr>
+      <w:r>
+        <w:drawing>
+          <wp:inline xmlns:a="http://schemas.openxmlformats.org/drawingml/2006/main" xmlns:pic="http://schemas.openxmlformats.org/drawingml/2006/picture">
+            <wp:extent cx="5394960" cy="5708620"/>
+            <wp:docPr id="4" name="Picture 4"/>
+            <wp:cNvGraphicFramePr>
+              <a:graphicFrameLocks noChangeAspect="1"/>
+            </wp:cNvGraphicFramePr>
+            <a:graphic>
+              <a:graphicData uri="http://schemas.openxmlformats.org/drawingml/2006/picture">
+                <pic:pic>
+                  <pic:nvPicPr>
+                    <pic:cNvPr id="0" name="flow_area.png"/>
+                    <pic:cNvPicPr/>
+                  </pic:nvPicPr>
+                  <pic:blipFill>
+                    <a:blip r:embed="rId13"/>
+                    <a:stretch>
+                      <a:fillRect/>
+                    </a:stretch>
+                  </pic:blipFill>
+                  <pic:spPr>
+                    <a:xfrm>
+                      <a:off x="0" y="0"/>
+                      <a:ext cx="5394960" cy="5708620"/>
+                    </a:xfrm>
+                    <a:prstGeom prst="rect"/>
+                  </pic:spPr>
+                </pic:pic>
+              </a:graphicData>
+            </a:graphic>
+          </wp:inline>
+        </w:drawing>
+      </w:r>
+    </w:p>
+    <w:p>
+      <w:pPr>
+        <w:pStyle w:val="Caption"/>
+        <w:spacing w:after="160"/>
+        <w:jc w:val="center"/>
+      </w:pPr>
+      <w:r>
+        <w:t>Figure 4. Field or area analysis, and the map-click check.</w:t>
+      </w:r>
+    </w:p>
+    <w:p>
+      <w:pPr>
+        <w:pStyle w:val="Heading1"/>
+        <w:pageBreakBefore/>
+        <w:spacing w:before="0"/>
+      </w:pPr>
+      <w:r>
+        <w:t>8. Calculations, step by step</w:t>
       </w:r>
     </w:p>
     <w:p>
@@ -2697,10 +2762,634 @@
     </w:p>
     <w:p>
       <w:pPr>
+        <w:pStyle w:val="Heading2"/>
+      </w:pPr>
+      <w:r>
+        <w:t>Field or area analysis (Figure 4)</w:t>
+      </w:r>
+    </w:p>
+    <w:tbl>
+      <w:tblPr>
+        <w:tblW w:type="auto" w:w="0"/>
+        <w:jc w:val="center"/>
+        <w:tblBorders>
+          <w:top w:val="single" w:sz="4" w:space="0" w:color="C9D1D9"/>
+          <w:left w:val="single" w:sz="4" w:space="0" w:color="C9D1D9"/>
+          <w:bottom w:val="single" w:sz="4" w:space="0" w:color="C9D1D9"/>
+          <w:right w:val="single" w:sz="4" w:space="0" w:color="C9D1D9"/>
+          <w:insideH w:val="single" w:sz="4" w:space="0" w:color="C9D1D9"/>
+          <w:insideV w:val="single" w:sz="4" w:space="0" w:color="C9D1D9"/>
+        </w:tblBorders>
+        <w:tblLayout w:type="fixed"/>
+        <w:tblLook w:firstColumn="1" w:firstRow="1" w:lastColumn="0" w:lastRow="0" w:noHBand="0" w:noVBand="1" w:val="04A0"/>
+      </w:tblPr>
+      <w:tblGrid>
+        <w:gridCol w:w="1944"/>
+        <w:gridCol w:w="4320"/>
+        <w:gridCol w:w="2232"/>
+        <w:gridCol w:w="1584"/>
+      </w:tblGrid>
+      <w:tr>
+        <w:trPr>
+          <w:tblHeader w:val="true"/>
+        </w:trPr>
+        <w:tc>
+          <w:tcPr>
+            <w:tcW w:type="dxa" w:w="1944"/>
+            <w:shd w:val="clear" w:color="auto" w:fill="323F4B"/>
+          </w:tcPr>
+          <w:p>
+            <w:r>
+              <w:rPr>
+                <w:b/>
+                <w:color w:val="FFFFFF"/>
+                <w:sz w:val="18"/>
+              </w:rPr>
+              <w:t>Step</w:t>
+            </w:r>
+          </w:p>
+        </w:tc>
+        <w:tc>
+          <w:tcPr>
+            <w:tcW w:type="dxa" w:w="4320"/>
+            <w:shd w:val="clear" w:color="auto" w:fill="323F4B"/>
+          </w:tcPr>
+          <w:p>
+            <w:r>
+              <w:rPr>
+                <w:b/>
+                <w:color w:val="FFFFFF"/>
+                <w:sz w:val="18"/>
+              </w:rPr>
+              <w:t>Rule or equation</w:t>
+            </w:r>
+          </w:p>
+        </w:tc>
+        <w:tc>
+          <w:tcPr>
+            <w:tcW w:type="dxa" w:w="2232"/>
+            <w:shd w:val="clear" w:color="auto" w:fill="323F4B"/>
+          </w:tcPr>
+          <w:p>
+            <w:r>
+              <w:rPr>
+                <w:b/>
+                <w:color w:val="FFFFFF"/>
+                <w:sz w:val="18"/>
+              </w:rPr>
+              <w:t>Inputs → output</w:t>
+            </w:r>
+          </w:p>
+        </w:tc>
+        <w:tc>
+          <w:tcPr>
+            <w:tcW w:type="dxa" w:w="1584"/>
+            <w:shd w:val="clear" w:color="auto" w:fill="323F4B"/>
+          </w:tcPr>
+          <w:p>
+            <w:r>
+              <w:rPr>
+                <w:b/>
+                <w:color w:val="FFFFFF"/>
+                <w:sz w:val="18"/>
+              </w:rPr>
+              <w:t>Where</w:t>
+            </w:r>
+          </w:p>
+        </w:tc>
+      </w:tr>
+      <w:tr>
+        <w:trPr>
+          <w:cantSplit/>
+        </w:trPr>
+        <w:tc>
+          <w:tcPr>
+            <w:tcW w:type="dxa" w:w="1944"/>
+          </w:tcPr>
+          <w:p>
+            <w:pPr>
+              <w:spacing w:after="0" w:line="240" w:lineRule="auto"/>
+            </w:pPr>
+            <w:r>
+              <w:rPr>
+                <w:b/>
+                <w:sz w:val="18"/>
+              </w:rPr>
+              <w:t>Read the boundary</w:t>
+            </w:r>
+          </w:p>
+        </w:tc>
+        <w:tc>
+          <w:tcPr>
+            <w:tcW w:type="dxa" w:w="4320"/>
+          </w:tcPr>
+          <w:p>
+            <w:pPr>
+              <w:spacing w:after="0" w:line="240" w:lineRule="auto"/>
+            </w:pPr>
+            <w:r>
+              <w:rPr>
+                <w:sz w:val="18"/>
+              </w:rPr>
+              <w:t>drawn corners, or a file: shpjs (reprojects with the .prj), togeojson (KML), JSZip (KMZ), GeoJSON; all polygons kept, limit 500 km²</w:t>
+            </w:r>
+          </w:p>
+        </w:tc>
+        <w:tc>
+          <w:tcPr>
+            <w:tcW w:type="dxa" w:w="2232"/>
+          </w:tcPr>
+          <w:p>
+            <w:pPr>
+              <w:spacing w:after="0" w:line="240" w:lineRule="auto"/>
+            </w:pPr>
+            <w:r>
+              <w:rPr>
+                <w:sz w:val="18"/>
+              </w:rPr>
+              <w:t>file → polygons, acres</w:t>
+            </w:r>
+          </w:p>
+        </w:tc>
+        <w:tc>
+          <w:tcPr>
+            <w:tcW w:type="dxa" w:w="1584"/>
+          </w:tcPr>
+          <w:p>
+            <w:pPr>
+              <w:spacing w:after="0" w:line="240" w:lineRule="auto"/>
+            </w:pPr>
+            <w:r>
+              <w:rPr>
+                <w:sz w:val="18"/>
+              </w:rPr>
+              <w:t xml:space="preserve">area.js · </w:t>
+            </w:r>
+            <w:r>
+              <w:rPr>
+                <w:rFonts w:ascii="Consolas" w:hAnsi="Consolas"/>
+                <w:sz w:val="16"/>
+              </w:rPr>
+              <w:t>parseFiles</w:t>
+            </w:r>
+            <w:r>
+              <w:rPr>
+                <w:sz w:val="18"/>
+              </w:rPr>
+              <w:t xml:space="preserve">, </w:t>
+            </w:r>
+            <w:r>
+              <w:rPr>
+                <w:rFonts w:ascii="Consolas" w:hAnsi="Consolas"/>
+                <w:sz w:val="16"/>
+              </w:rPr>
+              <w:t>polysArea</w:t>
+            </w:r>
+          </w:p>
+        </w:tc>
+      </w:tr>
+      <w:tr>
+        <w:trPr>
+          <w:cantSplit/>
+        </w:trPr>
+        <w:tc>
+          <w:tcPr>
+            <w:tcW w:type="dxa" w:w="1944"/>
+            <w:shd w:val="clear" w:color="auto" w:fill="F5F7FA"/>
+          </w:tcPr>
+          <w:p>
+            <w:pPr>
+              <w:spacing w:after="0" w:line="240" w:lineRule="auto"/>
+            </w:pPr>
+            <w:r>
+              <w:rPr>
+                <w:b/>
+                <w:sz w:val="18"/>
+              </w:rPr>
+              <w:t>Clip the soils</w:t>
+            </w:r>
+          </w:p>
+        </w:tc>
+        <w:tc>
+          <w:tcPr>
+            <w:tcW w:type="dxa" w:w="4320"/>
+            <w:shd w:val="clear" w:color="auto" w:fill="F5F7FA"/>
+          </w:tcPr>
+          <w:p>
+            <w:pPr>
+              <w:spacing w:after="0" w:line="240" w:lineRule="auto"/>
+            </w:pPr>
+            <w:r>
+              <w:rPr>
+                <w:rFonts w:ascii="Consolas" w:hAnsi="Consolas"/>
+                <w:sz w:val="16"/>
+              </w:rPr>
+              <w:t>mupolygongeo.STIntersection(boundary)</w:t>
+            </w:r>
+            <w:r>
+              <w:rPr>
+                <w:sz w:val="18"/>
+              </w:rPr>
+              <w:t xml:space="preserve"> on Soil Data Access (boundary simplified to ≤ 600 vertices); components with WEG, I, %; climatic factor C per map unit</w:t>
+            </w:r>
+          </w:p>
+        </w:tc>
+        <w:tc>
+          <w:tcPr>
+            <w:tcW w:type="dxa" w:w="2232"/>
+            <w:shd w:val="clear" w:color="auto" w:fill="F5F7FA"/>
+          </w:tcPr>
+          <w:p>
+            <w:pPr>
+              <w:spacing w:after="0" w:line="240" w:lineRule="auto"/>
+            </w:pPr>
+            <w:r>
+              <w:rPr>
+                <w:sz w:val="18"/>
+              </w:rPr>
+              <w:t>boundary → soil polygons</w:t>
+            </w:r>
+          </w:p>
+        </w:tc>
+        <w:tc>
+          <w:tcPr>
+            <w:tcW w:type="dxa" w:w="1584"/>
+            <w:shd w:val="clear" w:color="auto" w:fill="F5F7FA"/>
+          </w:tcPr>
+          <w:p>
+            <w:pPr>
+              <w:spacing w:after="0" w:line="240" w:lineRule="auto"/>
+            </w:pPr>
+            <w:r>
+              <w:rPr>
+                <w:sz w:val="18"/>
+              </w:rPr>
+              <w:t xml:space="preserve">area.js · </w:t>
+            </w:r>
+            <w:r>
+              <w:rPr>
+                <w:rFonts w:ascii="Consolas" w:hAnsi="Consolas"/>
+                <w:sz w:val="16"/>
+              </w:rPr>
+              <w:t>soils</w:t>
+            </w:r>
+          </w:p>
+        </w:tc>
+      </w:tr>
+      <w:tr>
+        <w:trPr>
+          <w:cantSplit/>
+        </w:trPr>
+        <w:tc>
+          <w:tcPr>
+            <w:tcW w:type="dxa" w:w="1944"/>
+          </w:tcPr>
+          <w:p>
+            <w:pPr>
+              <w:spacing w:after="0" w:line="240" w:lineRule="auto"/>
+            </w:pPr>
+            <w:r>
+              <w:rPr>
+                <w:b/>
+                <w:sz w:val="18"/>
+              </w:rPr>
+              <w:t>Left-out features</w:t>
+            </w:r>
+          </w:p>
+        </w:tc>
+        <w:tc>
+          <w:tcPr>
+            <w:tcW w:type="dxa" w:w="4320"/>
+          </w:tcPr>
+          <w:p>
+            <w:pPr>
+              <w:spacing w:after="0" w:line="240" w:lineRule="auto"/>
+            </w:pPr>
+            <w:r>
+              <w:rPr>
+                <w:sz w:val="18"/>
+              </w:rPr>
+              <w:t>USA Structures footprints; TIGER roads as bands (S1100 15 m, S1200 9 m, S1400 5 m … half-widths); NHD lakes, reservoirs, marshes, estuaries; SSURGO Water units</w:t>
+            </w:r>
+          </w:p>
+        </w:tc>
+        <w:tc>
+          <w:tcPr>
+            <w:tcW w:type="dxa" w:w="2232"/>
+          </w:tcPr>
+          <w:p>
+            <w:pPr>
+              <w:spacing w:after="0" w:line="240" w:lineRule="auto"/>
+            </w:pPr>
+            <w:r>
+              <w:rPr>
+                <w:sz w:val="18"/>
+              </w:rPr>
+              <w:t>boundary box → features</w:t>
+            </w:r>
+          </w:p>
+        </w:tc>
+        <w:tc>
+          <w:tcPr>
+            <w:tcW w:type="dxa" w:w="1584"/>
+          </w:tcPr>
+          <w:p>
+            <w:pPr>
+              <w:spacing w:after="0" w:line="240" w:lineRule="auto"/>
+            </w:pPr>
+            <w:r>
+              <w:rPr>
+                <w:sz w:val="18"/>
+              </w:rPr>
+              <w:t xml:space="preserve">area.js · </w:t>
+            </w:r>
+            <w:r>
+              <w:rPr>
+                <w:rFonts w:ascii="Consolas" w:hAnsi="Consolas"/>
+                <w:sz w:val="16"/>
+              </w:rPr>
+              <w:t>exclusions</w:t>
+            </w:r>
+          </w:p>
+        </w:tc>
+      </w:tr>
+      <w:tr>
+        <w:trPr>
+          <w:cantSplit/>
+        </w:trPr>
+        <w:tc>
+          <w:tcPr>
+            <w:tcW w:type="dxa" w:w="1944"/>
+            <w:shd w:val="clear" w:color="auto" w:fill="F5F7FA"/>
+          </w:tcPr>
+          <w:p>
+            <w:pPr>
+              <w:spacing w:after="0" w:line="240" w:lineRule="auto"/>
+            </w:pPr>
+            <w:r>
+              <w:rPr>
+                <w:b/>
+                <w:sz w:val="18"/>
+              </w:rPr>
+              <w:t>Sample</w:t>
+            </w:r>
+          </w:p>
+        </w:tc>
+        <w:tc>
+          <w:tcPr>
+            <w:tcW w:type="dxa" w:w="4320"/>
+            <w:shd w:val="clear" w:color="auto" w:fill="F5F7FA"/>
+          </w:tcPr>
+          <w:p>
+            <w:pPr>
+              <w:spacing w:after="0" w:line="240" w:lineRule="auto"/>
+            </w:pPr>
+            <w:r>
+              <w:rPr>
+                <w:sz w:val="18"/>
+              </w:rPr>
+              <w:t>≈ 20,000 stratified random points (one per grid cell, seeded) inside the boundary; drop left-out, outside-Texas and no-soil points</w:t>
+            </w:r>
+          </w:p>
+        </w:tc>
+        <w:tc>
+          <w:tcPr>
+            <w:tcW w:type="dxa" w:w="2232"/>
+            <w:shd w:val="clear" w:color="auto" w:fill="F5F7FA"/>
+          </w:tcPr>
+          <w:p>
+            <w:pPr>
+              <w:spacing w:after="0" w:line="240" w:lineRule="auto"/>
+            </w:pPr>
+            <w:r>
+              <w:rPr>
+                <w:sz w:val="18"/>
+              </w:rPr>
+              <w:t>points → kept points</w:t>
+            </w:r>
+          </w:p>
+        </w:tc>
+        <w:tc>
+          <w:tcPr>
+            <w:tcW w:type="dxa" w:w="1584"/>
+            <w:shd w:val="clear" w:color="auto" w:fill="F5F7FA"/>
+          </w:tcPr>
+          <w:p>
+            <w:pPr>
+              <w:spacing w:after="0" w:line="240" w:lineRule="auto"/>
+            </w:pPr>
+            <w:r>
+              <w:rPr>
+                <w:sz w:val="18"/>
+              </w:rPr>
+              <w:t xml:space="preserve">area.js · </w:t>
+            </w:r>
+            <w:r>
+              <w:rPr>
+                <w:rFonts w:ascii="Consolas" w:hAnsi="Consolas"/>
+                <w:sz w:val="16"/>
+              </w:rPr>
+              <w:t>samples</w:t>
+            </w:r>
+            <w:r>
+              <w:rPr>
+                <w:sz w:val="18"/>
+              </w:rPr>
+              <w:t xml:space="preserve">, </w:t>
+            </w:r>
+            <w:r>
+              <w:rPr>
+                <w:rFonts w:ascii="Consolas" w:hAnsi="Consolas"/>
+                <w:sz w:val="16"/>
+              </w:rPr>
+              <w:t>hitAt</w:t>
+            </w:r>
+          </w:p>
+        </w:tc>
+      </w:tr>
+      <w:tr>
+        <w:trPr>
+          <w:cantSplit/>
+        </w:trPr>
+        <w:tc>
+          <w:tcPr>
+            <w:tcW w:type="dxa" w:w="1944"/>
+          </w:tcPr>
+          <w:p>
+            <w:pPr>
+              <w:spacing w:after="0" w:line="240" w:lineRule="auto"/>
+            </w:pPr>
+            <w:r>
+              <w:rPr>
+                <w:b/>
+                <w:sz w:val="18"/>
+              </w:rPr>
+              <w:t>Shares</w:t>
+            </w:r>
+          </w:p>
+        </w:tc>
+        <w:tc>
+          <w:tcPr>
+            <w:tcW w:type="dxa" w:w="4320"/>
+          </w:tcPr>
+          <w:p>
+            <w:pPr>
+              <w:spacing w:after="0" w:line="240" w:lineRule="auto"/>
+            </w:pPr>
+            <w:r>
+              <w:rPr>
+                <w:sz w:val="18"/>
+              </w:rPr>
+              <w:t>share = Σ points Σ components (pct/100)·[class] ÷ Σ points Σ components (pct/100); E = I × C / 100; ± 0.7 points at 95 %</w:t>
+            </w:r>
+          </w:p>
+        </w:tc>
+        <w:tc>
+          <w:tcPr>
+            <w:tcW w:type="dxa" w:w="2232"/>
+          </w:tcPr>
+          <w:p>
+            <w:pPr>
+              <w:spacing w:after="0" w:line="240" w:lineRule="auto"/>
+            </w:pPr>
+            <w:r>
+              <w:rPr>
+                <w:sz w:val="18"/>
+              </w:rPr>
+              <w:t>kept points → % and acres</w:t>
+            </w:r>
+          </w:p>
+        </w:tc>
+        <w:tc>
+          <w:tcPr>
+            <w:tcW w:type="dxa" w:w="1584"/>
+          </w:tcPr>
+          <w:p>
+            <w:pPr>
+              <w:spacing w:after="0" w:line="240" w:lineRule="auto"/>
+            </w:pPr>
+            <w:r>
+              <w:rPr>
+                <w:sz w:val="18"/>
+              </w:rPr>
+              <w:t xml:space="preserve">area.js · </w:t>
+            </w:r>
+            <w:r>
+              <w:rPr>
+                <w:rFonts w:ascii="Consolas" w:hAnsi="Consolas"/>
+                <w:sz w:val="16"/>
+              </w:rPr>
+              <w:t>analyse</w:t>
+            </w:r>
+          </w:p>
+        </w:tc>
+      </w:tr>
+      <w:tr>
+        <w:trPr>
+          <w:cantSplit/>
+        </w:trPr>
+        <w:tc>
+          <w:tcPr>
+            <w:tcW w:type="dxa" w:w="1944"/>
+            <w:shd w:val="clear" w:color="auto" w:fill="F5F7FA"/>
+          </w:tcPr>
+          <w:p>
+            <w:pPr>
+              <w:spacing w:after="0" w:line="240" w:lineRule="auto"/>
+            </w:pPr>
+            <w:r>
+              <w:rPr>
+                <w:b/>
+                <w:sz w:val="18"/>
+              </w:rPr>
+              <w:t>Map-click check</w:t>
+            </w:r>
+          </w:p>
+        </w:tc>
+        <w:tc>
+          <w:tcPr>
+            <w:tcW w:type="dxa" w:w="4320"/>
+            <w:shd w:val="clear" w:color="auto" w:fill="F5F7FA"/>
+          </w:tcPr>
+          <w:p>
+            <w:pPr>
+              <w:spacing w:after="0" w:line="240" w:lineRule="auto"/>
+            </w:pPr>
+            <w:r>
+              <w:rPr>
+                <w:sz w:val="18"/>
+              </w:rPr>
+              <w:t>same layers in a ~180 m box; inside a building or water, or within a road half-width → refused; accepted if the services take &gt; 3.5 s</w:t>
+            </w:r>
+          </w:p>
+        </w:tc>
+        <w:tc>
+          <w:tcPr>
+            <w:tcW w:type="dxa" w:w="2232"/>
+            <w:shd w:val="clear" w:color="auto" w:fill="F5F7FA"/>
+          </w:tcPr>
+          <w:p>
+            <w:pPr>
+              <w:spacing w:after="0" w:line="240" w:lineRule="auto"/>
+            </w:pPr>
+            <w:r>
+              <w:rPr>
+                <w:sz w:val="18"/>
+              </w:rPr>
+              <w:t>click → accept or refuse</w:t>
+            </w:r>
+          </w:p>
+        </w:tc>
+        <w:tc>
+          <w:tcPr>
+            <w:tcW w:type="dxa" w:w="1584"/>
+            <w:shd w:val="clear" w:color="auto" w:fill="F5F7FA"/>
+          </w:tcPr>
+          <w:p>
+            <w:pPr>
+              <w:spacing w:after="0" w:line="240" w:lineRule="auto"/>
+            </w:pPr>
+            <w:r>
+              <w:rPr>
+                <w:sz w:val="18"/>
+              </w:rPr>
+              <w:t xml:space="preserve">area.js · </w:t>
+            </w:r>
+            <w:r>
+              <w:rPr>
+                <w:rFonts w:ascii="Consolas" w:hAnsi="Consolas"/>
+                <w:sz w:val="16"/>
+              </w:rPr>
+              <w:t>excludedAt</w:t>
+            </w:r>
+            <w:r>
+              <w:rPr>
+                <w:sz w:val="18"/>
+              </w:rPr>
+              <w:t xml:space="preserve">; app.js · </w:t>
+            </w:r>
+            <w:r>
+              <w:rPr>
+                <w:rFonts w:ascii="Consolas" w:hAnsi="Consolas"/>
+                <w:sz w:val="16"/>
+              </w:rPr>
+              <w:t>pickSite</w:t>
+            </w:r>
+          </w:p>
+        </w:tc>
+      </w:tr>
+    </w:tbl>
+    <w:p>
+      <w:pPr>
+        <w:spacing w:after="40"/>
+      </w:pPr>
+    </w:p>
+    <w:p>
+      <w:pPr>
         <w:pStyle w:val="Heading1"/>
       </w:pPr>
       <w:r>
-        <w:t>8. Data sources</w:t>
+        <w:t>9. Data sources</w:t>
       </w:r>
     </w:p>
     <w:tbl>
@@ -3535,7 +4224,7 @@
                 <w:b/>
                 <w:sz w:val="17"/>
               </w:rPr>
-              <w:t>Place search</w:t>
+              <w:t>Soil polygons inside a drawn or uploaded area</w:t>
             </w:r>
           </w:p>
         </w:tc>
@@ -3551,7 +4240,7 @@
               <w:rPr>
                 <w:sz w:val="17"/>
               </w:rPr>
-              <w:t>OpenStreetMap Nominatim</w:t>
+              <w:t>USDA-NRCS SSURGO</w:t>
             </w:r>
           </w:p>
         </w:tc>
@@ -3567,7 +4256,7 @@
               <w:rPr>
                 <w:sz w:val="17"/>
               </w:rPr>
-              <w:t>search API; results outside Texas are dropped</w:t>
+              <w:t>Soil Data Access spatial query, clipped to the boundary (direct)</w:t>
             </w:r>
           </w:p>
         </w:tc>
@@ -3583,7 +4272,7 @@
               <w:rPr>
                 <w:sz w:val="17"/>
               </w:rPr>
-              <w:t>—</w:t>
+              <w:t>map units, 1:12,000–1:24,000</w:t>
             </w:r>
           </w:p>
         </w:tc>
@@ -3599,7 +4288,7 @@
               <w:rPr>
                 <w:sz w:val="17"/>
               </w:rPr>
-              <w:t>type coordinates instead</w:t>
+              <w:t>—</w:t>
             </w:r>
           </w:p>
         </w:tc>
@@ -3622,7 +4311,7 @@
                 <w:b/>
                 <w:sz w:val="17"/>
               </w:rPr>
-              <w:t>Statewide map layers</w:t>
+              <w:t>Building footprints (area tool, map clicks)</w:t>
             </w:r>
           </w:p>
         </w:tc>
@@ -3639,7 +4328,7 @@
               <w:rPr>
                 <w:sz w:val="17"/>
               </w:rPr>
-              <w:t>SSURGO WEG/I (UC Davis SoilWeb), NRCS C, NASA POWER wind; built offline</w:t>
+              <w:t>FEMA / ORNL USA Structures</w:t>
             </w:r>
           </w:p>
         </w:tc>
@@ -3656,7 +4345,7 @@
               <w:rPr>
                 <w:sz w:val="17"/>
               </w:rPr>
-              <w:t>built into the app (data/layers.js and PNG overlays)</w:t>
+              <w:t>ArcGIS feature service (direct)</w:t>
             </w:r>
           </w:p>
         </w:tc>
@@ -3673,7 +4362,7 @@
               <w:rPr>
                 <w:sz w:val="17"/>
               </w:rPr>
-              <w:t>statewide grid</w:t>
+              <w:t>footprint polygons</w:t>
             </w:r>
           </w:p>
         </w:tc>
@@ -3690,7 +4379,7 @@
               <w:rPr>
                 <w:sz w:val="17"/>
               </w:rPr>
-              <w:t>display only</w:t>
+              <w:t>not removed; the panel says so</w:t>
             </w:r>
           </w:p>
         </w:tc>
@@ -3712,7 +4401,7 @@
                 <w:b/>
                 <w:sz w:val="17"/>
               </w:rPr>
-              <w:t>Base maps</w:t>
+              <w:t>Roads (area tool, map clicks)</w:t>
             </w:r>
           </w:p>
         </w:tc>
@@ -3728,7 +4417,7 @@
               <w:rPr>
                 <w:sz w:val="17"/>
               </w:rPr>
-              <w:t>Esri, USGS, OpenStreetMap</w:t>
+              <w:t>U.S. Census Bureau TIGER/Line</w:t>
             </w:r>
           </w:p>
         </w:tc>
@@ -3744,7 +4433,7 @@
               <w:rPr>
                 <w:sz w:val="17"/>
               </w:rPr>
-              <w:t>map tiles</w:t>
+              <w:t>TIGERweb map service (direct); widened by road class</w:t>
             </w:r>
           </w:p>
         </w:tc>
@@ -3760,13 +4449,458 @@
               <w:rPr>
                 <w:sz w:val="17"/>
               </w:rPr>
-              <w:t>—</w:t>
+              <w:t>road centrelines</w:t>
             </w:r>
           </w:p>
         </w:tc>
         <w:tc>
           <w:tcPr>
             <w:tcW w:type="dxa" w:w="1872"/>
+          </w:tcPr>
+          <w:p>
+            <w:pPr>
+              <w:spacing w:after="0" w:line="240" w:lineRule="auto"/>
+            </w:pPr>
+            <w:r>
+              <w:rPr>
+                <w:sz w:val="17"/>
+              </w:rPr>
+              <w:t>not removed; the panel says so</w:t>
+            </w:r>
+          </w:p>
+        </w:tc>
+      </w:tr>
+      <w:tr>
+        <w:trPr>
+          <w:cantSplit/>
+        </w:trPr>
+        <w:tc>
+          <w:tcPr>
+            <w:tcW w:type="dxa" w:w="2304"/>
+            <w:shd w:val="clear" w:color="auto" w:fill="F5F7FA"/>
+          </w:tcPr>
+          <w:p>
+            <w:pPr>
+              <w:spacing w:after="0" w:line="240" w:lineRule="auto"/>
+            </w:pPr>
+            <w:r>
+              <w:rPr>
+                <w:b/>
+                <w:sz w:val="17"/>
+              </w:rPr>
+              <w:t>Water bodies (area tool, map clicks)</w:t>
+            </w:r>
+          </w:p>
+        </w:tc>
+        <w:tc>
+          <w:tcPr>
+            <w:tcW w:type="dxa" w:w="2088"/>
+            <w:shd w:val="clear" w:color="auto" w:fill="F5F7FA"/>
+          </w:tcPr>
+          <w:p>
+            <w:pPr>
+              <w:spacing w:after="0" w:line="240" w:lineRule="auto"/>
+            </w:pPr>
+            <w:r>
+              <w:rPr>
+                <w:sz w:val="17"/>
+              </w:rPr>
+              <w:t>USGS NHD (lakes, reservoirs, marshes; playas stay in) + SSURGO Water units</w:t>
+            </w:r>
+          </w:p>
+        </w:tc>
+        <w:tc>
+          <w:tcPr>
+            <w:tcW w:type="dxa" w:w="2088"/>
+            <w:shd w:val="clear" w:color="auto" w:fill="F5F7FA"/>
+          </w:tcPr>
+          <w:p>
+            <w:pPr>
+              <w:spacing w:after="0" w:line="240" w:lineRule="auto"/>
+            </w:pPr>
+            <w:r>
+              <w:rPr>
+                <w:sz w:val="17"/>
+              </w:rPr>
+              <w:t>NHD map service (direct)</w:t>
+            </w:r>
+          </w:p>
+        </w:tc>
+        <w:tc>
+          <w:tcPr>
+            <w:tcW w:type="dxa" w:w="1728"/>
+            <w:shd w:val="clear" w:color="auto" w:fill="F5F7FA"/>
+          </w:tcPr>
+          <w:p>
+            <w:pPr>
+              <w:spacing w:after="0" w:line="240" w:lineRule="auto"/>
+            </w:pPr>
+            <w:r>
+              <w:rPr>
+                <w:sz w:val="17"/>
+              </w:rPr>
+              <w:t>1:24,000 polygons</w:t>
+            </w:r>
+          </w:p>
+        </w:tc>
+        <w:tc>
+          <w:tcPr>
+            <w:tcW w:type="dxa" w:w="1872"/>
+            <w:shd w:val="clear" w:color="auto" w:fill="F5F7FA"/>
+          </w:tcPr>
+          <w:p>
+            <w:pPr>
+              <w:spacing w:after="0" w:line="240" w:lineRule="auto"/>
+            </w:pPr>
+            <w:r>
+              <w:rPr>
+                <w:sz w:val="17"/>
+              </w:rPr>
+              <w:t>Esri's copy of NHD after 5 s (3 s for a click)</w:t>
+            </w:r>
+          </w:p>
+        </w:tc>
+      </w:tr>
+      <w:tr>
+        <w:trPr>
+          <w:cantSplit/>
+        </w:trPr>
+        <w:tc>
+          <w:tcPr>
+            <w:tcW w:type="dxa" w:w="2304"/>
+          </w:tcPr>
+          <w:p>
+            <w:pPr>
+              <w:spacing w:after="0" w:line="240" w:lineRule="auto"/>
+            </w:pPr>
+            <w:r>
+              <w:rPr>
+                <w:b/>
+                <w:sz w:val="17"/>
+              </w:rPr>
+              <w:t>Boundary files</w:t>
+            </w:r>
+          </w:p>
+        </w:tc>
+        <w:tc>
+          <w:tcPr>
+            <w:tcW w:type="dxa" w:w="2088"/>
+          </w:tcPr>
+          <w:p>
+            <w:pPr>
+              <w:spacing w:after="0" w:line="240" w:lineRule="auto"/>
+            </w:pPr>
+            <w:r>
+              <w:rPr>
+                <w:sz w:val="17"/>
+              </w:rPr>
+              <w:t>your shapefile, KML/KMZ or GeoJSON</w:t>
+            </w:r>
+          </w:p>
+        </w:tc>
+        <w:tc>
+          <w:tcPr>
+            <w:tcW w:type="dxa" w:w="2088"/>
+          </w:tcPr>
+          <w:p>
+            <w:pPr>
+              <w:spacing w:after="0" w:line="240" w:lineRule="auto"/>
+            </w:pPr>
+            <w:r>
+              <w:rPr>
+                <w:sz w:val="17"/>
+              </w:rPr>
+              <w:t>read in the browser with shpjs, togeojson, JSZip</w:t>
+            </w:r>
+          </w:p>
+        </w:tc>
+        <w:tc>
+          <w:tcPr>
+            <w:tcW w:type="dxa" w:w="1728"/>
+          </w:tcPr>
+          <w:p>
+            <w:pPr>
+              <w:spacing w:after="0" w:line="240" w:lineRule="auto"/>
+            </w:pPr>
+            <w:r>
+              <w:rPr>
+                <w:sz w:val="17"/>
+              </w:rPr>
+              <w:t>as drawn</w:t>
+            </w:r>
+          </w:p>
+        </w:tc>
+        <w:tc>
+          <w:tcPr>
+            <w:tcW w:type="dxa" w:w="1872"/>
+          </w:tcPr>
+          <w:p>
+            <w:pPr>
+              <w:spacing w:after="0" w:line="240" w:lineRule="auto"/>
+            </w:pPr>
+            <w:r>
+              <w:rPr>
+                <w:sz w:val="17"/>
+              </w:rPr>
+              <w:t>—</w:t>
+            </w:r>
+          </w:p>
+        </w:tc>
+      </w:tr>
+      <w:tr>
+        <w:trPr>
+          <w:cantSplit/>
+        </w:trPr>
+        <w:tc>
+          <w:tcPr>
+            <w:tcW w:type="dxa" w:w="2304"/>
+            <w:shd w:val="clear" w:color="auto" w:fill="F5F7FA"/>
+          </w:tcPr>
+          <w:p>
+            <w:pPr>
+              <w:spacing w:after="0" w:line="240" w:lineRule="auto"/>
+            </w:pPr>
+            <w:r>
+              <w:rPr>
+                <w:b/>
+                <w:sz w:val="17"/>
+              </w:rPr>
+              <w:t>Place search</w:t>
+            </w:r>
+          </w:p>
+        </w:tc>
+        <w:tc>
+          <w:tcPr>
+            <w:tcW w:type="dxa" w:w="2088"/>
+            <w:shd w:val="clear" w:color="auto" w:fill="F5F7FA"/>
+          </w:tcPr>
+          <w:p>
+            <w:pPr>
+              <w:spacing w:after="0" w:line="240" w:lineRule="auto"/>
+            </w:pPr>
+            <w:r>
+              <w:rPr>
+                <w:sz w:val="17"/>
+              </w:rPr>
+              <w:t>OpenStreetMap Nominatim</w:t>
+            </w:r>
+          </w:p>
+        </w:tc>
+        <w:tc>
+          <w:tcPr>
+            <w:tcW w:type="dxa" w:w="2088"/>
+            <w:shd w:val="clear" w:color="auto" w:fill="F5F7FA"/>
+          </w:tcPr>
+          <w:p>
+            <w:pPr>
+              <w:spacing w:after="0" w:line="240" w:lineRule="auto"/>
+            </w:pPr>
+            <w:r>
+              <w:rPr>
+                <w:sz w:val="17"/>
+              </w:rPr>
+              <w:t>search API; results outside Texas are dropped</w:t>
+            </w:r>
+          </w:p>
+        </w:tc>
+        <w:tc>
+          <w:tcPr>
+            <w:tcW w:type="dxa" w:w="1728"/>
+            <w:shd w:val="clear" w:color="auto" w:fill="F5F7FA"/>
+          </w:tcPr>
+          <w:p>
+            <w:pPr>
+              <w:spacing w:after="0" w:line="240" w:lineRule="auto"/>
+            </w:pPr>
+            <w:r>
+              <w:rPr>
+                <w:sz w:val="17"/>
+              </w:rPr>
+              <w:t>—</w:t>
+            </w:r>
+          </w:p>
+        </w:tc>
+        <w:tc>
+          <w:tcPr>
+            <w:tcW w:type="dxa" w:w="1872"/>
+            <w:shd w:val="clear" w:color="auto" w:fill="F5F7FA"/>
+          </w:tcPr>
+          <w:p>
+            <w:pPr>
+              <w:spacing w:after="0" w:line="240" w:lineRule="auto"/>
+            </w:pPr>
+            <w:r>
+              <w:rPr>
+                <w:sz w:val="17"/>
+              </w:rPr>
+              <w:t>type coordinates instead</w:t>
+            </w:r>
+          </w:p>
+        </w:tc>
+      </w:tr>
+      <w:tr>
+        <w:trPr>
+          <w:cantSplit/>
+        </w:trPr>
+        <w:tc>
+          <w:tcPr>
+            <w:tcW w:type="dxa" w:w="2304"/>
+          </w:tcPr>
+          <w:p>
+            <w:pPr>
+              <w:spacing w:after="0" w:line="240" w:lineRule="auto"/>
+            </w:pPr>
+            <w:r>
+              <w:rPr>
+                <w:b/>
+                <w:sz w:val="17"/>
+              </w:rPr>
+              <w:t>Statewide map layers</w:t>
+            </w:r>
+          </w:p>
+        </w:tc>
+        <w:tc>
+          <w:tcPr>
+            <w:tcW w:type="dxa" w:w="2088"/>
+          </w:tcPr>
+          <w:p>
+            <w:pPr>
+              <w:spacing w:after="0" w:line="240" w:lineRule="auto"/>
+            </w:pPr>
+            <w:r>
+              <w:rPr>
+                <w:sz w:val="17"/>
+              </w:rPr>
+              <w:t>SSURGO WEG/I (UC Davis SoilWeb), NRCS C, NASA POWER wind; built offline</w:t>
+            </w:r>
+          </w:p>
+        </w:tc>
+        <w:tc>
+          <w:tcPr>
+            <w:tcW w:type="dxa" w:w="2088"/>
+          </w:tcPr>
+          <w:p>
+            <w:pPr>
+              <w:spacing w:after="0" w:line="240" w:lineRule="auto"/>
+            </w:pPr>
+            <w:r>
+              <w:rPr>
+                <w:sz w:val="17"/>
+              </w:rPr>
+              <w:t>built into the app (data/layers.js and PNG overlays)</w:t>
+            </w:r>
+          </w:p>
+        </w:tc>
+        <w:tc>
+          <w:tcPr>
+            <w:tcW w:type="dxa" w:w="1728"/>
+          </w:tcPr>
+          <w:p>
+            <w:pPr>
+              <w:spacing w:after="0" w:line="240" w:lineRule="auto"/>
+            </w:pPr>
+            <w:r>
+              <w:rPr>
+                <w:sz w:val="17"/>
+              </w:rPr>
+              <w:t>statewide grid</w:t>
+            </w:r>
+          </w:p>
+        </w:tc>
+        <w:tc>
+          <w:tcPr>
+            <w:tcW w:type="dxa" w:w="1872"/>
+          </w:tcPr>
+          <w:p>
+            <w:pPr>
+              <w:spacing w:after="0" w:line="240" w:lineRule="auto"/>
+            </w:pPr>
+            <w:r>
+              <w:rPr>
+                <w:sz w:val="17"/>
+              </w:rPr>
+              <w:t>display only</w:t>
+            </w:r>
+          </w:p>
+        </w:tc>
+      </w:tr>
+      <w:tr>
+        <w:trPr>
+          <w:cantSplit/>
+        </w:trPr>
+        <w:tc>
+          <w:tcPr>
+            <w:tcW w:type="dxa" w:w="2304"/>
+            <w:shd w:val="clear" w:color="auto" w:fill="F5F7FA"/>
+          </w:tcPr>
+          <w:p>
+            <w:pPr>
+              <w:spacing w:after="0" w:line="240" w:lineRule="auto"/>
+            </w:pPr>
+            <w:r>
+              <w:rPr>
+                <w:b/>
+                <w:sz w:val="17"/>
+              </w:rPr>
+              <w:t>Base maps</w:t>
+            </w:r>
+          </w:p>
+        </w:tc>
+        <w:tc>
+          <w:tcPr>
+            <w:tcW w:type="dxa" w:w="2088"/>
+            <w:shd w:val="clear" w:color="auto" w:fill="F5F7FA"/>
+          </w:tcPr>
+          <w:p>
+            <w:pPr>
+              <w:spacing w:after="0" w:line="240" w:lineRule="auto"/>
+            </w:pPr>
+            <w:r>
+              <w:rPr>
+                <w:sz w:val="17"/>
+              </w:rPr>
+              <w:t>Esri, USGS, OpenStreetMap</w:t>
+            </w:r>
+          </w:p>
+        </w:tc>
+        <w:tc>
+          <w:tcPr>
+            <w:tcW w:type="dxa" w:w="2088"/>
+            <w:shd w:val="clear" w:color="auto" w:fill="F5F7FA"/>
+          </w:tcPr>
+          <w:p>
+            <w:pPr>
+              <w:spacing w:after="0" w:line="240" w:lineRule="auto"/>
+            </w:pPr>
+            <w:r>
+              <w:rPr>
+                <w:sz w:val="17"/>
+              </w:rPr>
+              <w:t>map tiles</w:t>
+            </w:r>
+          </w:p>
+        </w:tc>
+        <w:tc>
+          <w:tcPr>
+            <w:tcW w:type="dxa" w:w="1728"/>
+            <w:shd w:val="clear" w:color="auto" w:fill="F5F7FA"/>
+          </w:tcPr>
+          <w:p>
+            <w:pPr>
+              <w:spacing w:after="0" w:line="240" w:lineRule="auto"/>
+            </w:pPr>
+            <w:r>
+              <w:rPr>
+                <w:sz w:val="17"/>
+              </w:rPr>
+              <w:t>—</w:t>
+            </w:r>
+          </w:p>
+        </w:tc>
+        <w:tc>
+          <w:tcPr>
+            <w:tcW w:type="dxa" w:w="1872"/>
+            <w:shd w:val="clear" w:color="auto" w:fill="F5F7FA"/>
           </w:tcPr>
           <w:p>
             <w:pPr>
@@ -3792,7 +4926,7 @@
         <w:pStyle w:val="Heading1"/>
       </w:pPr>
       <w:r>
-        <w:t>9. Where each number on screen comes from</w:t>
+        <w:t>10. Where each number on screen comes from</w:t>
       </w:r>
     </w:p>
     <w:tbl>
@@ -4495,7 +5629,7 @@
                 <w:b/>
                 <w:sz w:val="18"/>
               </w:rPr>
-              <w:t>Statewide map colours</w:t>
+              <w:t>Area panel: WEG and risk-class shares, mean I and E</w:t>
             </w:r>
           </w:p>
         </w:tc>
@@ -4512,7 +5646,7 @@
               <w:rPr>
                 <w:sz w:val="18"/>
               </w:rPr>
-              <w:t>pre-computed offline</w:t>
+              <w:t>sampled shares, components weighted by %</w:t>
             </w:r>
           </w:p>
         </w:tc>
@@ -4520,6 +5654,60 @@
           <w:tcPr>
             <w:tcW w:type="dxa" w:w="4032"/>
             <w:shd w:val="clear" w:color="auto" w:fill="F5F7FA"/>
+          </w:tcPr>
+          <w:p>
+            <w:pPr>
+              <w:spacing w:after="0" w:line="240" w:lineRule="auto"/>
+            </w:pPr>
+            <w:r>
+              <w:rPr>
+                <w:sz w:val="18"/>
+              </w:rPr>
+              <w:t>SSURGO polygons and components; USA Structures, TIGER and NHD left out</w:t>
+            </w:r>
+          </w:p>
+        </w:tc>
+      </w:tr>
+      <w:tr>
+        <w:trPr>
+          <w:cantSplit/>
+        </w:trPr>
+        <w:tc>
+          <w:tcPr>
+            <w:tcW w:type="dxa" w:w="2880"/>
+          </w:tcPr>
+          <w:p>
+            <w:pPr>
+              <w:spacing w:after="0" w:line="240" w:lineRule="auto"/>
+            </w:pPr>
+            <w:r>
+              <w:rPr>
+                <w:b/>
+                <w:sz w:val="18"/>
+              </w:rPr>
+              <w:t>Statewide map colours</w:t>
+            </w:r>
+          </w:p>
+        </w:tc>
+        <w:tc>
+          <w:tcPr>
+            <w:tcW w:type="dxa" w:w="3168"/>
+          </w:tcPr>
+          <w:p>
+            <w:pPr>
+              <w:spacing w:after="0" w:line="240" w:lineRule="auto"/>
+            </w:pPr>
+            <w:r>
+              <w:rPr>
+                <w:sz w:val="18"/>
+              </w:rPr>
+              <w:t>pre-computed offline</w:t>
+            </w:r>
+          </w:p>
+        </w:tc>
+        <w:tc>
+          <w:tcPr>
+            <w:tcW w:type="dxa" w:w="4032"/>
           </w:tcPr>
           <w:p>
             <w:pPr>
@@ -4545,7 +5733,7 @@
         <w:pStyle w:val="Heading1"/>
       </w:pPr>
       <w:r>
-        <w:t>10. Fallbacks, limits and checks</w:t>
+        <w:t>11. Fallbacks, limits and checks</w:t>
       </w:r>
     </w:p>
     <w:p>
@@ -4662,6 +5850,21 @@
         <w:rPr>
           <w:b/>
         </w:rPr>
+        <w:t>Area results are estimates.</w:t>
+      </w:r>
+      <w:r>
+        <w:t xml:space="preserve"> Shares come from about 20,000 sample points (± 0.7 percentage points at 95 %) and from SSURGO components, which are not mapped separately inside a map unit. Buildings, roads and water are only as complete as USA Structures, TIGER and NHD; if one of them does not answer, the panel says it was not removed.</w:t>
+      </w:r>
+    </w:p>
+    <w:p>
+      <w:pPr>
+        <w:pStyle w:val="ListBullet"/>
+        <w:spacing w:after="60"/>
+      </w:pPr>
+      <w:r>
+        <w:rPr>
+          <w:b/>
+        </w:rPr>
         <w:t>Statewide layers are fixed.</w:t>
       </w:r>
       <w:r>
@@ -4688,7 +5891,7 @@
         <w:pStyle w:val="Heading1"/>
       </w:pPr>
       <w:r>
-        <w:t>11. Code map</w:t>
+        <w:t>12. Code map</w:t>
       </w:r>
     </w:p>
     <w:tbl>
@@ -5063,7 +6266,7 @@
                 <w:b/>
                 <w:sz w:val="18"/>
               </w:rPr>
-              <w:t>js/methods.js</w:t>
+              <w:t>js/area.js</w:t>
             </w:r>
           </w:p>
         </w:tc>
@@ -5080,7 +6283,7 @@
               <w:rPr>
                 <w:sz w:val="18"/>
               </w:rPr>
-              <w:t>Methods sheet: sources used at the point, source catalog, equations</w:t>
+              <w:t>field or area analysis: drawing, boundary files, clipped soils, left-out features, sampling, panel, CSV; map-click check</w:t>
             </w:r>
           </w:p>
         </w:tc>
@@ -5102,7 +6305,7 @@
                 <w:b/>
                 <w:sz w:val="18"/>
               </w:rPr>
-              <w:t>data/stations.js</w:t>
+              <w:t>js/methods.js</w:t>
             </w:r>
           </w:p>
         </w:tc>
@@ -5118,7 +6321,7 @@
               <w:rPr>
                 <w:sz w:val="18"/>
               </w:rPr>
-              <w:t>built-in airport list (made by tools/fetch_stations.py)</w:t>
+              <w:t>Methods sheet: sources used at the point, source catalog, equations</w:t>
             </w:r>
           </w:p>
         </w:tc>
@@ -5141,7 +6344,7 @@
                 <w:b/>
                 <w:sz w:val="18"/>
               </w:rPr>
-              <w:t>data/layers.js, data/*.png</w:t>
+              <w:t>data/stations.js</w:t>
             </w:r>
           </w:p>
         </w:tc>
@@ -5158,7 +6361,7 @@
               <w:rPr>
                 <w:sz w:val="18"/>
               </w:rPr>
-              <w:t>statewide layers and the Texas outline (made by tools/build_layers.py)</w:t>
+              <w:t>built-in airport list (made by tools/fetch_stations.py)</w:t>
             </w:r>
           </w:p>
         </w:tc>
@@ -5180,13 +6383,53 @@
                 <w:b/>
                 <w:sz w:val="18"/>
               </w:rPr>
-              <w:t>tools/*.py</w:t>
+              <w:t>data/layers.js, data/*.png</w:t>
             </w:r>
           </w:p>
         </w:tc>
         <w:tc>
           <w:tcPr>
             <w:tcW w:type="dxa" w:w="7344"/>
+          </w:tcPr>
+          <w:p>
+            <w:pPr>
+              <w:spacing w:after="0" w:line="240" w:lineRule="auto"/>
+            </w:pPr>
+            <w:r>
+              <w:rPr>
+                <w:sz w:val="18"/>
+              </w:rPr>
+              <w:t>statewide layers and the Texas outline (made by tools/build_layers.py)</w:t>
+            </w:r>
+          </w:p>
+        </w:tc>
+      </w:tr>
+      <w:tr>
+        <w:trPr>
+          <w:cantSplit/>
+        </w:trPr>
+        <w:tc>
+          <w:tcPr>
+            <w:tcW w:type="dxa" w:w="2736"/>
+            <w:shd w:val="clear" w:color="auto" w:fill="F5F7FA"/>
+          </w:tcPr>
+          <w:p>
+            <w:pPr>
+              <w:spacing w:after="0" w:line="240" w:lineRule="auto"/>
+            </w:pPr>
+            <w:r>
+              <w:rPr>
+                <w:b/>
+                <w:sz w:val="18"/>
+              </w:rPr>
+              <w:t>tools/*.py</w:t>
+            </w:r>
+          </w:p>
+        </w:tc>
+        <w:tc>
+          <w:tcPr>
+            <w:tcW w:type="dxa" w:w="7344"/>
+            <w:shd w:val="clear" w:color="auto" w:fill="F5F7FA"/>
           </w:tcPr>
           <w:p>
             <w:pPr>

</xml_diff>

<commit_message>
Turn soil map units off by default; show Census county lines
- County lines on by default, drawn per tile by the Census TIGERweb map
  service (exact at every zoom), lightened with a thin dark halo
- SSURGO map-unit lines and the area panel's soil colouring start off
- README and data-flow document note the layer sources and defaults

Co-Authored-By: Claude Opus 5.5 <noreply@anthropic.com>
</commit_message>
<xml_diff>
--- a/docs/WindGuard_TX_Data_Flow.docx
+++ b/docs/WindGuard_TX_Data_Flow.docx
@@ -31,7 +31,7 @@
           <w:color w:val="616E7C"/>
           <w:sz w:val="18"/>
         </w:rPr>
-        <w:t>App: barsa1ly.github.io/windguard-tx   ·   Code: github.com/barsa1ly/windguard-tx (commit cb3fec1)   ·   October 28, 2026</w:t>
+        <w:t>App: barsa1ly.github.io/windguard-tx   ·   Code: github.com/barsa1ly/windguard-tx (commit a8ab2ce)   ·   October 28, 2026</w:t>
       </w:r>
     </w:p>
     <w:p>
@@ -4842,7 +4842,7 @@
                 <w:b/>
                 <w:sz w:val="17"/>
               </w:rPr>
-              <w:t>Base maps</w:t>
+              <w:t>Base maps; county lines</w:t>
             </w:r>
           </w:p>
         </w:tc>
@@ -4859,7 +4859,7 @@
               <w:rPr>
                 <w:sz w:val="17"/>
               </w:rPr>
-              <w:t>Esri, USGS, OpenStreetMap</w:t>
+              <w:t>Esri, USGS, OpenStreetMap; U.S. Census TIGER (county lines)</w:t>
             </w:r>
           </w:p>
         </w:tc>
@@ -4876,7 +4876,7 @@
               <w:rPr>
                 <w:sz w:val="17"/>
               </w:rPr>
-              <w:t>map tiles</w:t>
+              <w:t>map tiles; TIGERweb map service drawn per tile</w:t>
             </w:r>
           </w:p>
         </w:tc>

</xml_diff>

<commit_message>
State picker; show only the chosen state
- Pill next to the logo opens a native list of all states (Texas available,
  the rest and Whole USA marked for later); phones show the code
- Everything outside the chosen state is covered by a mask above all map
  layers (below pins), with the state outline on top
- Panning is held to the state and zooming out stops at the whole-state view
- setRegion takes a list of states so several can be combined later

Co-Authored-By: Claude Opus 5.5 <noreply@anthropic.com>
</commit_message>
<xml_diff>
--- a/docs/WindGuard_TX_Data_Flow.docx
+++ b/docs/WindGuard_TX_Data_Flow.docx
@@ -31,7 +31,7 @@
           <w:color w:val="616E7C"/>
           <w:sz w:val="18"/>
         </w:rPr>
-        <w:t>App: barsa1ly.github.io/windguard-tx   ·   Code: github.com/barsa1ly/windguard-tx (commit a8ab2ce)   ·   October 28, 2026</w:t>
+        <w:t>App: barsa1ly.github.io/windguard-tx   ·   Code: github.com/barsa1ly/windguard-tx (commit a03eca2)   ·   October 28, 2026</w:t>
       </w:r>
     </w:p>
     <w:p>
@@ -135,7 +135,7 @@
         <w:t>Location check.</w:t>
       </w:r>
       <w:r>
-        <w:t xml:space="preserve"> The point is tested against the Texas outline drawn on the map (U.S. Census 1:5,000,000 state boundary). A map click or pin drag is also checked against building footprints (USA Structures), roads (Census TIGER) and water bodies (USGS NHD). If it fails, the app says why and downloads nothing. Place search lists only places inside Texas.</w:t>
+        <w:t xml:space="preserve"> The map shows only the state chosen in the picker (Texas for now; other states are listed for later), with everything outside it covered. The point is tested against the Texas outline (U.S. Census 1:5,000,000 state boundary). A map click or pin drag is also checked against building footprints (USA Structures), roads (Census TIGER) and water bodies (USGS NHD). If it fails, the app says why and downloads nothing. Place search lists only places inside Texas.</w:t>
       </w:r>
     </w:p>
     <w:p>

</xml_diff>

<commit_message>
Preview a download as charts before saving it
The data sheet's new Preview button runs everything a download runs except the
zip and draws what the writers were given: the daily weather as lines or bars by
day, month or year, with its gaps, the numbers behind it and the gap-free copy
some models get; each model's soil layers by depth; the wind series and
summaries; and the files themselves, with sizes and first lines. Each chart
downloads like the others. Weather and climate reads are kept, so Download after
Preview reads nothing twice, and a notice appears when a choice changes.

Co-Authored-By: Claude Opus 5.5 <noreply@anthropic.com>
</commit_message>
<xml_diff>
--- a/docs/WindGuard_TX_Data_Flow.docx
+++ b/docs/WindGuard_TX_Data_Flow.docx
@@ -31,7 +31,7 @@
           <w:color w:val="616E7C"/>
           <w:sz w:val="18"/>
         </w:rPr>
-        <w:t>App: barsa1ly.github.io/windguard-tx   ·   Code: github.com/barsa1ly/windguard-tx (commit c349376)   ·   October 30, 2026</w:t>
+        <w:t>App: barsa1ly.github.io/windguard-tx   ·   Code: github.com/barsa1ly/windguard-tx (commit 94ec673)   ·   October 30, 2026</w:t>
       </w:r>
     </w:p>
     <w:p>
@@ -240,7 +240,7 @@
         <w:t>Downloads.</w:t>
       </w:r>
       <w:r>
-        <w:t xml:space="preserve"> Every chart can be saved as PNG, TIFF or JPEG at a chosen size and DPI, or as CSV. The data sheet reads daily weather for the chosen dates (gridMET, NASA POWER or your file), takes the survey soil or yours, and writes files for DSSAT, SWAT+, EPIC, APEX, APSIM and AquaCrop into one zip (section 8).</w:t>
+        <w:t xml:space="preserve"> Every chart can be saved as PNG, TIFF or JPEG at a chosen size and DPI, or as CSV. The data sheet reads daily weather for the chosen dates (gridMET, NASA POWER or your file), takes the survey soil or yours, and writes files for DSSAT, SWAT+, EPIC, APEX, APSIM and AquaCrop into one zip (section 8). Its Preview button draws all of that as charts and tables first, with nothing saved.</w:t>
       </w:r>
     </w:p>
     <w:p>
@@ -7650,7 +7650,7 @@
                 <w:b/>
                 <w:sz w:val="18"/>
               </w:rPr>
-              <w:t>js/practices.js</w:t>
+              <w:t>js/preview.js</w:t>
             </w:r>
           </w:p>
         </w:tc>
@@ -7666,7 +7666,7 @@
               <w:rPr>
                 <w:sz w:val="18"/>
               </w:rPr>
-              <w:t>practice planner: questions, rules, specifications, species tables</w:t>
+              <w:t>the data sheet's preview: charts and tables of what a download will hold, before it is saved</w:t>
             </w:r>
           </w:p>
         </w:tc>
@@ -7689,7 +7689,7 @@
                 <w:b/>
                 <w:sz w:val="18"/>
               </w:rPr>
-              <w:t>js/area.js</w:t>
+              <w:t>js/practices.js</w:t>
             </w:r>
           </w:p>
         </w:tc>
@@ -7706,7 +7706,7 @@
               <w:rPr>
                 <w:sz w:val="18"/>
               </w:rPr>
-              <w:t>field or area analysis: drawing, boundary files, clipped soils, left-out features, sampling, panel, CSV; map-click check</w:t>
+              <w:t>practice planner: questions, rules, specifications, species tables</w:t>
             </w:r>
           </w:p>
         </w:tc>
@@ -7728,7 +7728,7 @@
                 <w:b/>
                 <w:sz w:val="18"/>
               </w:rPr>
-              <w:t>js/methods.js</w:t>
+              <w:t>js/area.js</w:t>
             </w:r>
           </w:p>
         </w:tc>
@@ -7744,7 +7744,7 @@
               <w:rPr>
                 <w:sz w:val="18"/>
               </w:rPr>
-              <w:t>Methods sheet: sources used at the point, source catalog, equations</w:t>
+              <w:t>field or area analysis: drawing, boundary files, clipped soils, left-out features, sampling, panel, CSV; map-click check</w:t>
             </w:r>
           </w:p>
         </w:tc>
@@ -7767,7 +7767,7 @@
                 <w:b/>
                 <w:sz w:val="18"/>
               </w:rPr>
-              <w:t>data/stations.js</w:t>
+              <w:t>js/methods.js</w:t>
             </w:r>
           </w:p>
         </w:tc>
@@ -7784,7 +7784,7 @@
               <w:rPr>
                 <w:sz w:val="18"/>
               </w:rPr>
-              <w:t>built-in airport list (made by tools/fetch_stations.py)</w:t>
+              <w:t>Methods sheet: sources used at the point, source catalog, equations</w:t>
             </w:r>
           </w:p>
         </w:tc>
@@ -7806,7 +7806,7 @@
                 <w:b/>
                 <w:sz w:val="18"/>
               </w:rPr>
-              <w:t>data/layers.js, data/*.png</w:t>
+              <w:t>data/stations.js</w:t>
             </w:r>
           </w:p>
         </w:tc>
@@ -7822,7 +7822,7 @@
               <w:rPr>
                 <w:sz w:val="18"/>
               </w:rPr>
-              <w:t>statewide layers and the Texas outline (made by tools/build_layers.py)</w:t>
+              <w:t>built-in airport list (made by tools/fetch_stations.py)</w:t>
             </w:r>
           </w:p>
         </w:tc>
@@ -7845,7 +7845,7 @@
                 <w:b/>
                 <w:sz w:val="18"/>
               </w:rPr>
-              <w:t>tools/*.py</w:t>
+              <w:t>data/layers.js, data/*.png</w:t>
             </w:r>
           </w:p>
         </w:tc>
@@ -7853,6 +7853,44 @@
           <w:tcPr>
             <w:tcW w:type="dxa" w:w="7344"/>
             <w:shd w:val="clear" w:color="auto" w:fill="F5F7FA"/>
+          </w:tcPr>
+          <w:p>
+            <w:pPr>
+              <w:spacing w:after="0" w:line="240" w:lineRule="auto"/>
+            </w:pPr>
+            <w:r>
+              <w:rPr>
+                <w:sz w:val="18"/>
+              </w:rPr>
+              <w:t>statewide layers and the Texas outline (made by tools/build_layers.py)</w:t>
+            </w:r>
+          </w:p>
+        </w:tc>
+      </w:tr>
+      <w:tr>
+        <w:trPr>
+          <w:cantSplit/>
+        </w:trPr>
+        <w:tc>
+          <w:tcPr>
+            <w:tcW w:type="dxa" w:w="2736"/>
+          </w:tcPr>
+          <w:p>
+            <w:pPr>
+              <w:spacing w:after="0" w:line="240" w:lineRule="auto"/>
+            </w:pPr>
+            <w:r>
+              <w:rPr>
+                <w:b/>
+                <w:sz w:val="18"/>
+              </w:rPr>
+              <w:t>tools/*.py</w:t>
+            </w:r>
+          </w:p>
+        </w:tc>
+        <w:tc>
+          <w:tcPr>
+            <w:tcW w:type="dxa" w:w="7344"/>
           </w:tcPr>
           <w:p>
             <w:pPr>

</xml_diff>

<commit_message>
Show the layout of your own files; templates with your columns and units
The data sheet now shows what a weather or soil file should look like. Tick the
columns you have, choose each one's unit, see the layout, and download it as a
CSV or Excel template, with examples or, for soil, this location's survey layers
as its rows. The template's column names state the units, so the filled-in file
loads with nothing else to set.

The weather reader takes each column's unit from its name (tmax (F),
Rain_mm_Tot, SlrW_Avg, WS_ms_Avg) and a wind column's height (wind at 3 m (mph),
WS10M, u2); the sheet's choices apply to the other columns and re-read the file
when changed. It adds kelvin, cm of rain, kJ and J of solar radiation, and
humidity as a fraction, says what each column was read in, and notes a value that
does not fit its unit. Soil files can be Excel too.

Co-Authored-By: Claude Opus 5.5 <noreply@anthropic.com>
</commit_message>
<xml_diff>
--- a/docs/WindGuard_TX_Data_Flow.docx
+++ b/docs/WindGuard_TX_Data_Flow.docx
@@ -31,7 +31,7 @@
           <w:color w:val="616E7C"/>
           <w:sz w:val="18"/>
         </w:rPr>
-        <w:t>App: barsa1ly.github.io/windguard-tx   ·   Code: github.com/barsa1ly/windguard-tx (commit 94ec673)   ·   October 30, 2026</w:t>
+        <w:t>App: barsa1ly.github.io/windguard-tx   ·   Code: github.com/barsa1ly/windguard-tx (commit 03671cf)   ·   October 30, 2026</w:t>
       </w:r>
     </w:p>
     <w:p>
@@ -7689,7 +7689,7 @@
                 <w:b/>
                 <w:sz w:val="18"/>
               </w:rPr>
-              <w:t>js/practices.js</w:t>
+              <w:t>js/templates.js</w:t>
             </w:r>
           </w:p>
         </w:tc>
@@ -7706,7 +7706,7 @@
               <w:rPr>
                 <w:sz w:val="18"/>
               </w:rPr>
-              <w:t>practice planner: questions, rules, specifications, species tables</w:t>
+              <w:t>the layout of your own weather and soil files: tick the columns, choose units, download a template</w:t>
             </w:r>
           </w:p>
         </w:tc>
@@ -7728,7 +7728,7 @@
                 <w:b/>
                 <w:sz w:val="18"/>
               </w:rPr>
-              <w:t>js/area.js</w:t>
+              <w:t>js/practices.js</w:t>
             </w:r>
           </w:p>
         </w:tc>
@@ -7744,7 +7744,7 @@
               <w:rPr>
                 <w:sz w:val="18"/>
               </w:rPr>
-              <w:t>field or area analysis: drawing, boundary files, clipped soils, left-out features, sampling, panel, CSV; map-click check</w:t>
+              <w:t>practice planner: questions, rules, specifications, species tables</w:t>
             </w:r>
           </w:p>
         </w:tc>
@@ -7767,7 +7767,7 @@
                 <w:b/>
                 <w:sz w:val="18"/>
               </w:rPr>
-              <w:t>js/methods.js</w:t>
+              <w:t>js/area.js</w:t>
             </w:r>
           </w:p>
         </w:tc>
@@ -7784,7 +7784,7 @@
               <w:rPr>
                 <w:sz w:val="18"/>
               </w:rPr>
-              <w:t>Methods sheet: sources used at the point, source catalog, equations</w:t>
+              <w:t>field or area analysis: drawing, boundary files, clipped soils, left-out features, sampling, panel, CSV; map-click check</w:t>
             </w:r>
           </w:p>
         </w:tc>
@@ -7806,7 +7806,7 @@
                 <w:b/>
                 <w:sz w:val="18"/>
               </w:rPr>
-              <w:t>data/stations.js</w:t>
+              <w:t>js/methods.js</w:t>
             </w:r>
           </w:p>
         </w:tc>
@@ -7822,7 +7822,7 @@
               <w:rPr>
                 <w:sz w:val="18"/>
               </w:rPr>
-              <w:t>built-in airport list (made by tools/fetch_stations.py)</w:t>
+              <w:t>Methods sheet: sources used at the point, source catalog, equations</w:t>
             </w:r>
           </w:p>
         </w:tc>
@@ -7845,7 +7845,7 @@
                 <w:b/>
                 <w:sz w:val="18"/>
               </w:rPr>
-              <w:t>data/layers.js, data/*.png</w:t>
+              <w:t>data/stations.js</w:t>
             </w:r>
           </w:p>
         </w:tc>
@@ -7862,7 +7862,7 @@
               <w:rPr>
                 <w:sz w:val="18"/>
               </w:rPr>
-              <w:t>statewide layers and the Texas outline (made by tools/build_layers.py)</w:t>
+              <w:t>built-in airport list (made by tools/fetch_stations.py)</w:t>
             </w:r>
           </w:p>
         </w:tc>
@@ -7884,6 +7884,45 @@
                 <w:b/>
                 <w:sz w:val="18"/>
               </w:rPr>
+              <w:t>data/layers.js, data/*.png</w:t>
+            </w:r>
+          </w:p>
+        </w:tc>
+        <w:tc>
+          <w:tcPr>
+            <w:tcW w:type="dxa" w:w="7344"/>
+          </w:tcPr>
+          <w:p>
+            <w:pPr>
+              <w:spacing w:after="0" w:line="240" w:lineRule="auto"/>
+            </w:pPr>
+            <w:r>
+              <w:rPr>
+                <w:sz w:val="18"/>
+              </w:rPr>
+              <w:t>statewide layers and the Texas outline (made by tools/build_layers.py)</w:t>
+            </w:r>
+          </w:p>
+        </w:tc>
+      </w:tr>
+      <w:tr>
+        <w:trPr>
+          <w:cantSplit/>
+        </w:trPr>
+        <w:tc>
+          <w:tcPr>
+            <w:tcW w:type="dxa" w:w="2736"/>
+            <w:shd w:val="clear" w:color="auto" w:fill="F5F7FA"/>
+          </w:tcPr>
+          <w:p>
+            <w:pPr>
+              <w:spacing w:after="0" w:line="240" w:lineRule="auto"/>
+            </w:pPr>
+            <w:r>
+              <w:rPr>
+                <w:b/>
+                <w:sz w:val="18"/>
+              </w:rPr>
               <w:t>tools/*.py</w:t>
             </w:r>
           </w:p>
@@ -7891,6 +7930,7 @@
         <w:tc>
           <w:tcPr>
             <w:tcW w:type="dxa" w:w="7344"/>
+            <w:shd w:val="clear" w:color="auto" w:fill="F5F7FA"/>
           </w:tcPr>
           <w:p>
             <w:pPr>

</xml_diff>